<commit_message>
Format validation report percentages to two significant digits
</commit_message>
<xml_diff>
--- a/regions/HS_077/Model_validation_077HS_1_Eastern_tropical_Pacific_(1993-1997).docx
+++ b/regions/HS_077/Model_validation_077HS_1_Eastern_tropical_Pacific_(1993-1997).docx
@@ -7,7 +7,7 @@
         <w:pStyle w:val="Title"/>
       </w:pPr>
       <w:r>
-        <w:t>Regional model validation record</w:t>
+        <w:t>HS 077 model validation</w:t>
       </w:r>
     </w:p>
     <w:tbl>
@@ -754,6 +754,198 @@
       <w:tr>
         <w:trPr>
           <w:cantSplit/>
+          <w:cantSplit/>
+        </w:trPr>
+        <w:tc>
+          <w:tcPr>
+            <w:tcW w:type="dxa" w:w="2203"/>
+            <w:vAlign w:val="center"/>
+            <w:shd w:fill="FFFFFF"/>
+            <w:tcMar>
+              <w:top w:w="90" w:type="dxa"/>
+              <w:bottom w:w="90" w:type="dxa"/>
+              <w:left w:w="110" w:type="dxa"/>
+              <w:right w:w="110" w:type="dxa"/>
+            </w:tcMar>
+            <w:tcBorders>
+              <w:top w:val="single" w:sz="5" w:color="D9D9D9"/>
+              <w:left w:val="single" w:sz="5" w:color="D9D9D9"/>
+              <w:bottom w:val="single" w:sz="5" w:color="D9D9D9"/>
+              <w:right w:val="single" w:sz="5" w:color="D9D9D9"/>
+            </w:tcBorders>
+          </w:tcPr>
+          <w:p>
+            <w:pPr>
+              <w:spacing w:after="40"/>
+            </w:pPr>
+            <w:r>
+              <w:rPr>
+                <w:b/>
+                <w:sz w:val="21"/>
+              </w:rPr>
+              <w:t>GE diagnostics</w:t>
+            </w:r>
+          </w:p>
+        </w:tc>
+        <w:tc>
+          <w:tcPr>
+            <w:tcW w:type="dxa" w:w="7834"/>
+            <w:vAlign w:val="center"/>
+            <w:shd w:fill="FFFFFF"/>
+            <w:tcMar>
+              <w:top w:w="90" w:type="dxa"/>
+              <w:bottom w:w="90" w:type="dxa"/>
+              <w:left w:w="110" w:type="dxa"/>
+              <w:right w:w="110" w:type="dxa"/>
+            </w:tcMar>
+            <w:tcBorders>
+              <w:top w:val="single" w:sz="5" w:color="D9D9D9"/>
+              <w:left w:val="single" w:sz="5" w:color="D9D9D9"/>
+              <w:bottom w:val="single" w:sz="5" w:color="D9D9D9"/>
+              <w:right w:val="single" w:sz="5" w:color="D9D9D9"/>
+            </w:tcBorders>
+          </w:tcPr>
+          <w:p>
+            <w:pPr>
+              <w:spacing w:after="40" w:before="0" w:line="240" w:lineRule="auto"/>
+            </w:pPr>
+            <w:r>
+              <w:t>OK</w:t>
+            </w:r>
+          </w:p>
+          <w:p>
+            <w:pPr>
+              <w:spacing w:after="40" w:before="0" w:line="240" w:lineRule="auto"/>
+            </w:pPr>
+            <w:r>
+              <w:t>No negative SPPR entries across the basal-source columns.</w:t>
+            </w:r>
+          </w:p>
+          <w:p>
+            <w:pPr>
+              <w:spacing w:after="40" w:before="0" w:line="240" w:lineRule="auto"/>
+            </w:pPr>
+            <w:r>
+              <w:t>rho_living = 0.538806</w:t>
+            </w:r>
+          </w:p>
+          <w:p>
+            <w:pPr>
+              <w:spacing w:after="40" w:before="0" w:line="240" w:lineRule="auto"/>
+            </w:pPr>
+            <w:r>
+              <w:t>b = 0</w:t>
+            </w:r>
+          </w:p>
+          <w:p>
+            <w:pPr>
+              <w:spacing w:after="40" w:before="0" w:line="240" w:lineRule="auto"/>
+            </w:pPr>
+            <w:r>
+              <w:t>Detritus (39): SPPR = 1.689166</w:t>
+            </w:r>
+          </w:p>
+        </w:tc>
+      </w:tr>
+      <w:tr>
+        <w:trPr>
+          <w:cantSplit/>
+          <w:cantSplit/>
+        </w:trPr>
+        <w:tc>
+          <w:tcPr>
+            <w:tcW w:type="dxa" w:w="2203"/>
+            <w:vAlign w:val="center"/>
+            <w:shd w:fill="FFFFFF"/>
+            <w:tcMar>
+              <w:top w:w="90" w:type="dxa"/>
+              <w:bottom w:w="90" w:type="dxa"/>
+              <w:left w:w="110" w:type="dxa"/>
+              <w:right w:w="110" w:type="dxa"/>
+            </w:tcMar>
+            <w:tcBorders>
+              <w:top w:val="single" w:sz="5" w:color="D9D9D9"/>
+              <w:left w:val="single" w:sz="5" w:color="D9D9D9"/>
+              <w:bottom w:val="single" w:sz="5" w:color="D9D9D9"/>
+              <w:right w:val="single" w:sz="5" w:color="D9D9D9"/>
+            </w:tcBorders>
+          </w:tcPr>
+          <w:p>
+            <w:pPr>
+              <w:spacing w:after="40"/>
+            </w:pPr>
+            <w:r>
+              <w:rPr>
+                <w:b/>
+                <w:sz w:val="21"/>
+              </w:rPr>
+              <w:t>TE diagnostics</w:t>
+            </w:r>
+          </w:p>
+        </w:tc>
+        <w:tc>
+          <w:tcPr>
+            <w:tcW w:type="dxa" w:w="7834"/>
+            <w:vAlign w:val="center"/>
+            <w:shd w:fill="FFFFFF"/>
+            <w:tcMar>
+              <w:top w:w="90" w:type="dxa"/>
+              <w:bottom w:w="90" w:type="dxa"/>
+              <w:left w:w="110" w:type="dxa"/>
+              <w:right w:w="110" w:type="dxa"/>
+            </w:tcMar>
+            <w:tcBorders>
+              <w:top w:val="single" w:sz="5" w:color="D9D9D9"/>
+              <w:left w:val="single" w:sz="5" w:color="D9D9D9"/>
+              <w:bottom w:val="single" w:sz="5" w:color="D9D9D9"/>
+              <w:right w:val="single" w:sz="5" w:color="D9D9D9"/>
+            </w:tcBorders>
+          </w:tcPr>
+          <w:p>
+            <w:pPr>
+              <w:spacing w:after="40" w:before="0" w:line="240" w:lineRule="auto"/>
+            </w:pPr>
+            <w:r>
+              <w:t>FAIL — negative SPPR and primary-production budget closure.</w:t>
+            </w:r>
+          </w:p>
+          <w:p>
+            <w:pPr>
+              <w:spacing w:after="40" w:before="0" w:line="240" w:lineRule="auto"/>
+            </w:pPr>
+            <w:r>
+              <w:t>Negative SPPR: diet_import (40): Toothed whales (4); Small producers (38): Toothed whales (4); Large phytoplankton (37): Toothed whales (4).</w:t>
+            </w:r>
+          </w:p>
+          <w:p>
+            <w:pPr>
+              <w:spacing w:after="40" w:before="0" w:line="240" w:lineRule="auto"/>
+            </w:pPr>
+            <w:r>
+              <w:t>rho_living = 0.627205</w:t>
+            </w:r>
+          </w:p>
+          <w:p>
+            <w:pPr>
+              <w:spacing w:after="40" w:before="0" w:line="240" w:lineRule="auto"/>
+            </w:pPr>
+            <w:r>
+              <w:t>Detritus (39): SPPR = 0.033546</w:t>
+            </w:r>
+          </w:p>
+          <w:p>
+            <w:pPr>
+              <w:spacing w:after="40" w:before="0" w:line="240" w:lineRule="auto"/>
+            </w:pPr>
+            <w:r>
+              <w:t>PP-budget relative gap = 1.752875; near-zero efficiencies in five mammal/bird groups.</w:t>
+            </w:r>
+          </w:p>
+        </w:tc>
+      </w:tr>
+      <w:tr>
+        <w:trPr>
+          <w:cantSplit/>
         </w:trPr>
         <w:tc>
           <w:tcPr>
@@ -828,232 +1020,6 @@
                 <w:color w:val="000000"/>
               </w:rPr>
               <w:t xml:space="preserve">[Excluded groups, scope and relevant values; other adjustments]</w:t>
-            </w:r>
-          </w:p>
-        </w:tc>
-      </w:tr>
-    </w:tbl>
-    <w:p>
-      <w:pPr>
-        <w:spacing w:after="40" w:before="0" w:line="240" w:lineRule="auto"/>
-        <w:pageBreakBefore/>
-      </w:pPr>
-      <w:r>
-        <w:rPr>
-          <w:rFonts w:ascii="Calibri" w:hAnsi="Calibri"/>
-          <w:sz w:val="2"/>
-          <w:color w:val="000000"/>
-        </w:rPr>
-        <w:t xml:space="preserve"/>
-      </w:r>
-    </w:p>
-    <w:tbl>
-      <w:tblPr>
-        <w:tblW w:type="auto" w:w="0"/>
-        <w:jc w:val="center"/>
-        <w:tblLayout w:type="fixed"/>
-        <w:tblLook w:firstColumn="1" w:firstRow="1" w:lastColumn="0" w:lastRow="0" w:noHBand="0" w:noVBand="1" w:val="04A0"/>
-      </w:tblPr>
-      <w:tblGrid>
-        <w:gridCol w:w="2203"/>
-        <w:gridCol w:w="7834"/>
-      </w:tblGrid>
-      <w:tr>
-        <w:trPr>
-          <w:cantSplit/>
-          <w:tblHeader/>
-          <w:tblHeader/>
-          <w:cantSplit/>
-        </w:trPr>
-        <w:tc>
-          <w:tcPr>
-            <w:tcW w:type="dxa" w:w="2203"/>
-            <w:vAlign w:val="center"/>
-            <w:shd w:fill="E5ECF0"/>
-            <w:tcMar>
-              <w:top w:w="90" w:type="dxa"/>
-              <w:bottom w:w="90" w:type="dxa"/>
-              <w:left w:w="110" w:type="dxa"/>
-              <w:right w:w="110" w:type="dxa"/>
-            </w:tcMar>
-            <w:tcBorders>
-              <w:top w:val="single" w:sz="5" w:color="D9D9D9"/>
-              <w:left w:val="single" w:sz="5" w:color="D9D9D9"/>
-              <w:bottom w:val="single" w:sz="5" w:color="D9D9D9"/>
-              <w:right w:val="single" w:sz="5" w:color="D9D9D9"/>
-            </w:tcBorders>
-          </w:tcPr>
-          <w:p>
-            <w:pPr>
-              <w:spacing w:after="40"/>
-            </w:pPr>
-            <w:r>
-              <w:rPr>
-                <w:b/>
-                <w:sz w:val="21"/>
-              </w:rPr>
-              <w:t>Field</w:t>
-            </w:r>
-          </w:p>
-        </w:tc>
-        <w:tc>
-          <w:tcPr>
-            <w:tcW w:type="dxa" w:w="7834"/>
-            <w:vAlign w:val="center"/>
-            <w:shd w:fill="E5ECF0"/>
-            <w:tcMar>
-              <w:top w:w="90" w:type="dxa"/>
-              <w:bottom w:w="90" w:type="dxa"/>
-              <w:left w:w="110" w:type="dxa"/>
-              <w:right w:w="110" w:type="dxa"/>
-            </w:tcMar>
-            <w:tcBorders>
-              <w:top w:val="single" w:sz="5" w:color="D9D9D9"/>
-              <w:left w:val="single" w:sz="5" w:color="D9D9D9"/>
-              <w:bottom w:val="single" w:sz="5" w:color="D9D9D9"/>
-              <w:right w:val="single" w:sz="5" w:color="D9D9D9"/>
-            </w:tcBorders>
-          </w:tcPr>
-          <w:p>
-            <w:pPr>
-              <w:spacing w:after="40" w:before="0" w:line="240" w:lineRule="auto"/>
-            </w:pPr>
-            <w:r>
-              <w:rPr>
-                <w:rFonts w:ascii="Calibri" w:hAnsi="Calibri"/>
-                <w:sz w:val="21"/>
-                <w:color w:val="000000"/>
-                <w:b/>
-              </w:rPr>
-              <w:t xml:space="preserve">Entry</w:t>
-            </w:r>
-          </w:p>
-        </w:tc>
-      </w:tr>
-      <w:tr>
-        <w:trPr>
-          <w:cantSplit/>
-          <w:cantSplit/>
-        </w:trPr>
-        <w:tc>
-          <w:tcPr>
-            <w:tcW w:type="dxa" w:w="2203"/>
-            <w:vAlign w:val="center"/>
-            <w:shd w:fill="FFFFFF"/>
-            <w:tcMar>
-              <w:top w:w="90" w:type="dxa"/>
-              <w:bottom w:w="90" w:type="dxa"/>
-              <w:left w:w="110" w:type="dxa"/>
-              <w:right w:w="110" w:type="dxa"/>
-            </w:tcMar>
-            <w:tcBorders>
-              <w:top w:val="single" w:sz="5" w:color="D9D9D9"/>
-              <w:left w:val="single" w:sz="5" w:color="D9D9D9"/>
-              <w:bottom w:val="single" w:sz="5" w:color="D9D9D9"/>
-              <w:right w:val="single" w:sz="5" w:color="D9D9D9"/>
-            </w:tcBorders>
-          </w:tcPr>
-          <w:p>
-            <w:pPr>
-              <w:spacing w:after="40"/>
-            </w:pPr>
-            <w:r>
-              <w:rPr>
-                <w:b/>
-                <w:sz w:val="21"/>
-              </w:rPr>
-              <w:t>GE diagnostics</w:t>
-            </w:r>
-          </w:p>
-        </w:tc>
-        <w:tc>
-          <w:tcPr>
-            <w:tcW w:type="dxa" w:w="7834"/>
-            <w:vAlign w:val="center"/>
-            <w:shd w:fill="FFFFFF"/>
-            <w:tcMar>
-              <w:top w:w="90" w:type="dxa"/>
-              <w:bottom w:w="90" w:type="dxa"/>
-              <w:left w:w="110" w:type="dxa"/>
-              <w:right w:w="110" w:type="dxa"/>
-            </w:tcMar>
-            <w:tcBorders>
-              <w:top w:val="single" w:sz="5" w:color="D9D9D9"/>
-              <w:left w:val="single" w:sz="5" w:color="D9D9D9"/>
-              <w:bottom w:val="single" w:sz="5" w:color="D9D9D9"/>
-              <w:right w:val="single" w:sz="5" w:color="D9D9D9"/>
-            </w:tcBorders>
-          </w:tcPr>
-          <w:p>
-            <w:pPr>
-              <w:spacing w:after="40" w:before="0" w:line="240" w:lineRule="auto"/>
-            </w:pPr>
-            <w:r>
-              <w:t>No negative SPPR entries across the basal-source columns. rho_living=0.53880579; b=0.00000000; Detritus(39) SPPR=1.68916596.</w:t>
-            </w:r>
-          </w:p>
-        </w:tc>
-      </w:tr>
-      <w:tr>
-        <w:trPr>
-          <w:cantSplit/>
-          <w:cantSplit/>
-        </w:trPr>
-        <w:tc>
-          <w:tcPr>
-            <w:tcW w:type="dxa" w:w="2203"/>
-            <w:vAlign w:val="center"/>
-            <w:shd w:fill="FFFFFF"/>
-            <w:tcMar>
-              <w:top w:w="90" w:type="dxa"/>
-              <w:bottom w:w="90" w:type="dxa"/>
-              <w:left w:w="110" w:type="dxa"/>
-              <w:right w:w="110" w:type="dxa"/>
-            </w:tcMar>
-            <w:tcBorders>
-              <w:top w:val="single" w:sz="5" w:color="D9D9D9"/>
-              <w:left w:val="single" w:sz="5" w:color="D9D9D9"/>
-              <w:bottom w:val="single" w:sz="5" w:color="D9D9D9"/>
-              <w:right w:val="single" w:sz="5" w:color="D9D9D9"/>
-            </w:tcBorders>
-          </w:tcPr>
-          <w:p>
-            <w:pPr>
-              <w:spacing w:after="40"/>
-            </w:pPr>
-            <w:r>
-              <w:rPr>
-                <w:b/>
-                <w:sz w:val="21"/>
-              </w:rPr>
-              <w:t>TE diagnostics</w:t>
-            </w:r>
-          </w:p>
-        </w:tc>
-        <w:tc>
-          <w:tcPr>
-            <w:tcW w:type="dxa" w:w="7834"/>
-            <w:vAlign w:val="center"/>
-            <w:shd w:fill="FFFFFF"/>
-            <w:tcMar>
-              <w:top w:w="90" w:type="dxa"/>
-              <w:bottom w:w="90" w:type="dxa"/>
-              <w:left w:w="110" w:type="dxa"/>
-              <w:right w:w="110" w:type="dxa"/>
-            </w:tcMar>
-            <w:tcBorders>
-              <w:top w:val="single" w:sz="5" w:color="D9D9D9"/>
-              <w:left w:val="single" w:sz="5" w:color="D9D9D9"/>
-              <w:bottom w:val="single" w:sz="5" w:color="D9D9D9"/>
-              <w:right w:val="single" w:sz="5" w:color="D9D9D9"/>
-            </w:tcBorders>
-          </w:tcPr>
-          <w:p>
-            <w:pPr>
-              <w:spacing w:after="40" w:before="0" w:line="240" w:lineRule="auto"/>
-            </w:pPr>
-            <w:r>
-              <w:t>Negative sources: diet_import(40) → Toothed whales(4); Small producers(38) → Toothed whales(4); Large phytoplankton(37) → Toothed whales(4). rho_living=0.62720534; Detritus(39) SPPR=0.03354576.</w:t>
             </w:r>
           </w:p>
         </w:tc>
@@ -1257,7 +1223,7 @@
               <w:spacing w:after="40" w:before="0" w:line="240" w:lineRule="auto"/>
             </w:pPr>
             <w:r>
-              <w:t>TE fails PP-budget closure (relative gap 1.75287544) and has near-zero efficiencies in five mammal/bird groups. GE and With Egestion direct OK apply to the accepted transformed runtime; source/ecological admission remains unestablished.</w:t>
+              <w:t>GE and With Egestion direct OK apply to the accepted transformed runtime; source/ecological admission remains unestablished.</w:t>
             </w:r>
             <w:r>
               <w:t xml:space="preserve"> </w:t>
@@ -1422,6 +1388,7 @@
         <w:keepNext/>
         <w:pageBreakBefore/>
         <w:spacing w:after="120"/>
+        <w:pStyle w:val="Heading1"/>
       </w:pPr>
       <w:r>
         <w:rPr>
@@ -1581,7 +1548,7 @@
                 <w:color w:val="000000"/>
                 <w:sz w:val="20"/>
               </w:rPr>
-              <w:t>Taxa</w:t>
+              <w:t>Taxa (n)</w:t>
             </w:r>
           </w:p>
         </w:tc>
@@ -1614,7 +1581,7 @@
                 <w:color w:val="000000"/>
                 <w:sz w:val="20"/>
               </w:rPr>
-              <w:t>Catch percentage</w:t>
+              <w:t>Catch (%)</w:t>
             </w:r>
           </w:p>
         </w:tc>
@@ -1647,7 +1614,7 @@
                 <w:color w:val="000000"/>
                 <w:sz w:val="20"/>
               </w:rPr>
-              <w:t>PPR percentage</w:t>
+              <w:t>Simple-chain PPR (%)</w:t>
             </w:r>
           </w:p>
         </w:tc>
@@ -1733,7 +1700,7 @@
               <w:jc w:val="center"/>
             </w:pPr>
             <w:r>
-              <w:t>53.8378%</w:t>
+              <w:t>54%</w:t>
             </w:r>
           </w:p>
         </w:tc>
@@ -1760,7 +1727,7 @@
               <w:jc w:val="center"/>
             </w:pPr>
             <w:r>
-              <w:t>53.0702%</w:t>
+              <w:t>53%</w:t>
             </w:r>
           </w:p>
         </w:tc>
@@ -1846,7 +1813,7 @@
               <w:jc w:val="center"/>
             </w:pPr>
             <w:r>
-              <w:t>44.0842%</w:t>
+              <w:t>44%</w:t>
             </w:r>
           </w:p>
         </w:tc>
@@ -1873,7 +1840,7 @@
               <w:jc w:val="center"/>
             </w:pPr>
             <w:r>
-              <w:t>46.4103%</w:t>
+              <w:t>46%</w:t>
             </w:r>
           </w:p>
         </w:tc>
@@ -1959,7 +1926,7 @@
               <w:jc w:val="center"/>
             </w:pPr>
             <w:r>
-              <w:t>0.0000%</w:t>
+              <w:t>0%</w:t>
             </w:r>
           </w:p>
         </w:tc>
@@ -1986,7 +1953,7 @@
               <w:jc w:val="center"/>
             </w:pPr>
             <w:r>
-              <w:t>0.0000%</w:t>
+              <w:t>0%</w:t>
             </w:r>
           </w:p>
         </w:tc>
@@ -2072,7 +2039,7 @@
               <w:jc w:val="center"/>
             </w:pPr>
             <w:r>
-              <w:t>2.0780%</w:t>
+              <w:t>2.1%</w:t>
             </w:r>
           </w:p>
         </w:tc>
@@ -2099,7 +2066,7 @@
               <w:jc w:val="center"/>
             </w:pPr>
             <w:r>
-              <w:t>0.5194%</w:t>
+              <w:t>0.52%</w:t>
             </w:r>
           </w:p>
         </w:tc>
@@ -2185,7 +2152,7 @@
               <w:jc w:val="center"/>
             </w:pPr>
             <w:r>
-              <w:t>0.0000%</w:t>
+              <w:t>0%</w:t>
             </w:r>
           </w:p>
         </w:tc>
@@ -2212,7 +2179,7 @@
               <w:jc w:val="center"/>
             </w:pPr>
             <w:r>
-              <w:t>0.0000%</w:t>
+              <w:t>0%</w:t>
             </w:r>
           </w:p>
         </w:tc>
@@ -2231,7 +2198,7 @@
           <w:color w:val="000000"/>
           <w:sz w:val="21"/>
         </w:rPr>
-        <w:t>The summary uses the weaker required membership or allocation confidence. The following tables show each component separately.</w:t>
+        <w:t>Overall confidence uses the weaker required membership or allocation component.</w:t>
       </w:r>
     </w:p>
     <w:p>
@@ -2448,7 +2415,7 @@
               <w:jc w:val="center"/>
             </w:pPr>
             <w:r>
-              <w:t>98.7237%</w:t>
+              <w:t>99%</w:t>
             </w:r>
           </w:p>
         </w:tc>
@@ -2534,7 +2501,7 @@
               <w:jc w:val="center"/>
             </w:pPr>
             <w:r>
-              <w:t>0.5194%</w:t>
+              <w:t>0.52%</w:t>
             </w:r>
           </w:p>
         </w:tc>
@@ -2620,7 +2587,7 @@
               <w:jc w:val="center"/>
             </w:pPr>
             <w:r>
-              <w:t>0.4922%</w:t>
+              <w:t>0.49%</w:t>
             </w:r>
           </w:p>
         </w:tc>
@@ -2706,7 +2673,7 @@
               <w:jc w:val="center"/>
             </w:pPr>
             <w:r>
-              <w:t>0.2071%</w:t>
+              <w:t>0.21%</w:t>
             </w:r>
           </w:p>
         </w:tc>
@@ -2792,7 +2759,7 @@
               <w:jc w:val="center"/>
             </w:pPr>
             <w:r>
-              <w:t>0.0575%</w:t>
+              <w:t>0.058%</w:t>
             </w:r>
           </w:p>
         </w:tc>
@@ -2878,7 +2845,7 @@
               <w:jc w:val="center"/>
             </w:pPr>
             <w:r>
-              <w:t>0.0000%</w:t>
+              <w:t>0%</w:t>
             </w:r>
           </w:p>
         </w:tc>
@@ -3117,7 +3084,7 @@
               <w:jc w:val="center"/>
             </w:pPr>
             <w:r>
-              <w:t>53.0702%</w:t>
+              <w:t>53%</w:t>
             </w:r>
           </w:p>
         </w:tc>
@@ -3203,7 +3170,7 @@
               <w:jc w:val="center"/>
             </w:pPr>
             <w:r>
-              <w:t>46.8406%</w:t>
+              <w:t>47%</w:t>
             </w:r>
           </w:p>
         </w:tc>
@@ -3289,7 +3256,7 @@
               <w:jc w:val="center"/>
             </w:pPr>
             <w:r>
-              <w:t>0.0892%</w:t>
+              <w:t>0.089%</w:t>
             </w:r>
           </w:p>
         </w:tc>
@@ -3321,15 +3288,372 @@
         <w:spacing w:after="120"/>
       </w:pPr>
       <w:r>
-        <w:t>Unresolved: none. Very low: Elasmobranchii and the two unidentified marine/pelagic finfish labels use assumed represented-pool composition; Thunnus maccoyii uses a Pacific bluefin analogue. These four labels represent 2.0780% of landings and 0.5194% of simple-chain PPR. Exact candidates and limitations are in the appendix.</w:t>
+        <w:t>Unresolved taxa: none. Four Very low decisions represent 2.0780% of landings and 0.5194% of simple-chain PPR.</w:t>
       </w:r>
     </w:p>
     <w:p>
       <w:pPr>
-        <w:pStyle w:val="Title"/>
+        <w:pStyle w:val="Heading2"/>
+      </w:pPr>
+      <w:r>
+        <w:t>Very low decisions</w:t>
+      </w:r>
+    </w:p>
+    <w:tbl>
+      <w:tblPr>
+        <w:tblW w:type="auto" w:w="0"/>
+        <w:jc w:val="center"/>
+        <w:tblLayout w:type="fixed"/>
+        <w:tblLook w:firstColumn="1" w:firstRow="1" w:lastColumn="0" w:lastRow="0" w:noHBand="0" w:noVBand="1" w:val="04A0"/>
+      </w:tblPr>
+      <w:tblGrid>
+        <w:gridCol w:w="3298"/>
+        <w:gridCol w:w="6710"/>
+      </w:tblGrid>
+      <w:tr>
+        <w:trPr>
+          <w:cantSplit/>
+          <w:tblHeader/>
+        </w:trPr>
+        <w:tc>
+          <w:tcPr>
+            <w:tcW w:type="dxa" w:w="3298"/>
+            <w:vAlign w:val="center"/>
+            <w:shd w:fill="E5ECF0"/>
+            <w:tcMar>
+              <w:top w:w="90" w:type="dxa"/>
+              <w:bottom w:w="90" w:type="dxa"/>
+              <w:left w:w="110" w:type="dxa"/>
+              <w:right w:w="110" w:type="dxa"/>
+            </w:tcMar>
+            <w:tcBorders>
+              <w:top w:val="single" w:sz="5" w:color="D9D9D9"/>
+              <w:left w:val="single" w:sz="5" w:color="D9D9D9"/>
+              <w:bottom w:val="single" w:sz="5" w:color="D9D9D9"/>
+              <w:right w:val="single" w:sz="5" w:color="D9D9D9"/>
+            </w:tcBorders>
+          </w:tcPr>
+          <w:p>
+            <w:pPr>
+              <w:spacing w:after="40"/>
+            </w:pPr>
+            <w:r>
+              <w:rPr>
+                <w:rFonts w:ascii="Calibri" w:hAnsi="Calibri"/>
+                <w:b/>
+                <w:sz w:val="21"/>
+              </w:rPr>
+              <w:t>Affected taxa</w:t>
+            </w:r>
+          </w:p>
+        </w:tc>
+        <w:tc>
+          <w:tcPr>
+            <w:tcW w:type="dxa" w:w="6710"/>
+            <w:vAlign w:val="center"/>
+            <w:shd w:fill="E5ECF0"/>
+            <w:tcMar>
+              <w:top w:w="90" w:type="dxa"/>
+              <w:bottom w:w="90" w:type="dxa"/>
+              <w:left w:w="110" w:type="dxa"/>
+              <w:right w:w="110" w:type="dxa"/>
+            </w:tcMar>
+            <w:tcBorders>
+              <w:top w:val="single" w:sz="5" w:color="D9D9D9"/>
+              <w:left w:val="single" w:sz="5" w:color="D9D9D9"/>
+              <w:bottom w:val="single" w:sz="5" w:color="D9D9D9"/>
+              <w:right w:val="single" w:sz="5" w:color="D9D9D9"/>
+            </w:tcBorders>
+          </w:tcPr>
+          <w:p>
+            <w:pPr>
+              <w:spacing w:after="40"/>
+            </w:pPr>
+            <w:r>
+              <w:rPr>
+                <w:rFonts w:ascii="Calibri" w:hAnsi="Calibri"/>
+                <w:b/>
+                <w:sz w:val="21"/>
+              </w:rPr>
+              <w:t>Why confidence is very low</w:t>
+            </w:r>
+          </w:p>
+        </w:tc>
+      </w:tr>
+      <w:tr>
+        <w:trPr>
+          <w:cantSplit/>
+        </w:trPr>
+        <w:tc>
+          <w:tcPr>
+            <w:tcW w:type="dxa" w:w="3298"/>
+            <w:vAlign w:val="center"/>
+            <w:shd w:fill="FFFFFF"/>
+            <w:tcMar>
+              <w:top w:w="90" w:type="dxa"/>
+              <w:bottom w:w="90" w:type="dxa"/>
+              <w:left w:w="110" w:type="dxa"/>
+              <w:right w:w="110" w:type="dxa"/>
+            </w:tcMar>
+            <w:tcBorders>
+              <w:top w:val="single" w:sz="5" w:color="D9D9D9"/>
+              <w:left w:val="single" w:sz="5" w:color="D9D9D9"/>
+              <w:bottom w:val="single" w:sz="5" w:color="D9D9D9"/>
+              <w:right w:val="single" w:sz="5" w:color="D9D9D9"/>
+            </w:tcBorders>
+          </w:tcPr>
+          <w:p>
+            <w:pPr>
+              <w:spacing w:after="40"/>
+            </w:pPr>
+            <w:r>
+              <w:rPr>
+                <w:rFonts w:ascii="Calibri" w:hAnsi="Calibri"/>
+                <w:sz w:val="21"/>
+              </w:rPr>
+              <w:t>Elasmobranchii</w:t>
+            </w:r>
+          </w:p>
+        </w:tc>
+        <w:tc>
+          <w:tcPr>
+            <w:tcW w:type="dxa" w:w="6710"/>
+            <w:vAlign w:val="center"/>
+            <w:shd w:fill="FFFFFF"/>
+            <w:tcMar>
+              <w:top w:w="90" w:type="dxa"/>
+              <w:bottom w:w="90" w:type="dxa"/>
+              <w:left w:w="110" w:type="dxa"/>
+              <w:right w:w="110" w:type="dxa"/>
+            </w:tcMar>
+            <w:tcBorders>
+              <w:top w:val="single" w:sz="5" w:color="D9D9D9"/>
+              <w:left w:val="single" w:sz="5" w:color="D9D9D9"/>
+              <w:bottom w:val="single" w:sz="5" w:color="D9D9D9"/>
+              <w:right w:val="single" w:sz="5" w:color="D9D9D9"/>
+            </w:tcBorders>
+          </w:tcPr>
+          <w:p>
+            <w:pPr>
+              <w:spacing w:after="40"/>
+            </w:pPr>
+            <w:r>
+              <w:rPr>
+                <w:rFonts w:ascii="Calibri" w:hAnsi="Calibri"/>
+                <w:sz w:val="21"/>
+              </w:rPr>
+              <w:t>Unknown sharks, rays and skates composition is approximated by both shark stages and the Manta ray pool. Other rays/skates and benthic elasmobranchs are unrepresented. Source-removal proportions are transferred across areas, years and catch bases.</w:t>
+            </w:r>
+          </w:p>
+        </w:tc>
+      </w:tr>
+      <w:tr>
+        <w:trPr>
+          <w:cantSplit/>
+        </w:trPr>
+        <w:tc>
+          <w:tcPr>
+            <w:tcW w:type="dxa" w:w="3298"/>
+            <w:vAlign w:val="center"/>
+            <w:shd w:fill="FFFFFF"/>
+            <w:tcMar>
+              <w:top w:w="90" w:type="dxa"/>
+              <w:bottom w:w="90" w:type="dxa"/>
+              <w:left w:w="110" w:type="dxa"/>
+              <w:right w:w="110" w:type="dxa"/>
+            </w:tcMar>
+            <w:tcBorders>
+              <w:top w:val="single" w:sz="5" w:color="D9D9D9"/>
+              <w:left w:val="single" w:sz="5" w:color="D9D9D9"/>
+              <w:bottom w:val="single" w:sz="5" w:color="D9D9D9"/>
+              <w:right w:val="single" w:sz="5" w:color="D9D9D9"/>
+            </w:tcBorders>
+          </w:tcPr>
+          <w:p>
+            <w:pPr>
+              <w:spacing w:after="40"/>
+            </w:pPr>
+            <w:r>
+              <w:rPr>
+                <w:rFonts w:ascii="Calibri" w:hAnsi="Calibri"/>
+                <w:sz w:val="21"/>
+              </w:rPr>
+              <w:t>Marine pelagic fishes not identified</w:t>
+            </w:r>
+          </w:p>
+        </w:tc>
+        <w:tc>
+          <w:tcPr>
+            <w:tcW w:type="dxa" w:w="6710"/>
+            <w:vAlign w:val="center"/>
+            <w:shd w:fill="FFFFFF"/>
+            <w:tcMar>
+              <w:top w:w="90" w:type="dxa"/>
+              <w:bottom w:w="90" w:type="dxa"/>
+              <w:left w:w="110" w:type="dxa"/>
+              <w:right w:w="110" w:type="dxa"/>
+            </w:tcMar>
+            <w:tcBorders>
+              <w:top w:val="single" w:sz="5" w:color="D9D9D9"/>
+              <w:left w:val="single" w:sz="5" w:color="D9D9D9"/>
+              <w:bottom w:val="single" w:sz="5" w:color="D9D9D9"/>
+              <w:right w:val="single" w:sz="5" w:color="D9D9D9"/>
+            </w:tcBorders>
+          </w:tcPr>
+          <w:p>
+            <w:pPr>
+              <w:spacing w:after="40"/>
+            </w:pPr>
+            <w:r>
+              <w:rPr>
+                <w:rFonts w:ascii="Calibri" w:hAnsi="Calibri"/>
+                <w:sz w:val="21"/>
+              </w:rPr>
+              <w:t>Unknown finfish composition is approximated by 22 named and residual fish pools, including flyingfishes and mesopelagic fishes. Omitted pelagic lineages remain uncertain. Model biomass assumes regional composition and catchability, fixed across years.</w:t>
+            </w:r>
+          </w:p>
+        </w:tc>
+      </w:tr>
+      <w:tr>
+        <w:trPr>
+          <w:cantSplit/>
+        </w:trPr>
+        <w:tc>
+          <w:tcPr>
+            <w:tcW w:type="dxa" w:w="3298"/>
+            <w:vAlign w:val="center"/>
+            <w:shd w:fill="FFFFFF"/>
+            <w:tcMar>
+              <w:top w:w="90" w:type="dxa"/>
+              <w:bottom w:w="90" w:type="dxa"/>
+              <w:left w:w="110" w:type="dxa"/>
+              <w:right w:w="110" w:type="dxa"/>
+            </w:tcMar>
+            <w:tcBorders>
+              <w:top w:val="single" w:sz="5" w:color="D9D9D9"/>
+              <w:left w:val="single" w:sz="5" w:color="D9D9D9"/>
+              <w:bottom w:val="single" w:sz="5" w:color="D9D9D9"/>
+              <w:right w:val="single" w:sz="5" w:color="D9D9D9"/>
+            </w:tcBorders>
+          </w:tcPr>
+          <w:p>
+            <w:pPr>
+              <w:spacing w:after="40"/>
+            </w:pPr>
+            <w:r>
+              <w:rPr>
+                <w:rFonts w:ascii="Calibri" w:hAnsi="Calibri"/>
+                <w:sz w:val="21"/>
+              </w:rPr>
+              <w:t>Marine fishes not identified</w:t>
+            </w:r>
+          </w:p>
+        </w:tc>
+        <w:tc>
+          <w:tcPr>
+            <w:tcW w:type="dxa" w:w="6710"/>
+            <w:vAlign w:val="center"/>
+            <w:shd w:fill="FFFFFF"/>
+            <w:tcMar>
+              <w:top w:w="90" w:type="dxa"/>
+              <w:bottom w:w="90" w:type="dxa"/>
+              <w:left w:w="110" w:type="dxa"/>
+              <w:right w:w="110" w:type="dxa"/>
+            </w:tcMar>
+            <w:tcBorders>
+              <w:top w:val="single" w:sz="5" w:color="D9D9D9"/>
+              <w:left w:val="single" w:sz="5" w:color="D9D9D9"/>
+              <w:bottom w:val="single" w:sz="5" w:color="D9D9D9"/>
+              <w:right w:val="single" w:sz="5" w:color="D9D9D9"/>
+            </w:tcBorders>
+          </w:tcPr>
+          <w:p>
+            <w:pPr>
+              <w:spacing w:after="40"/>
+            </w:pPr>
+            <w:r>
+              <w:rPr>
+                <w:rFonts w:ascii="Calibri" w:hAnsi="Calibri"/>
+                <w:sz w:val="21"/>
+              </w:rPr>
+              <w:t>The provider medium-demersal label uses the 22 represented fish pools as a weak pelagic proxy. Benthic/coastal habitats are absent. Model biomass assumes composition and catchability across the regional catch series.</w:t>
+            </w:r>
+          </w:p>
+        </w:tc>
+      </w:tr>
+      <w:tr>
+        <w:trPr>
+          <w:cantSplit/>
+        </w:trPr>
+        <w:tc>
+          <w:tcPr>
+            <w:tcW w:type="dxa" w:w="3298"/>
+            <w:vAlign w:val="center"/>
+            <w:shd w:fill="FFFFFF"/>
+            <w:tcMar>
+              <w:top w:w="90" w:type="dxa"/>
+              <w:bottom w:w="90" w:type="dxa"/>
+              <w:left w:w="110" w:type="dxa"/>
+              <w:right w:w="110" w:type="dxa"/>
+            </w:tcMar>
+            <w:tcBorders>
+              <w:top w:val="single" w:sz="5" w:color="D9D9D9"/>
+              <w:left w:val="single" w:sz="5" w:color="D9D9D9"/>
+              <w:bottom w:val="single" w:sz="5" w:color="D9D9D9"/>
+              <w:right w:val="single" w:sz="5" w:color="D9D9D9"/>
+            </w:tcBorders>
+          </w:tcPr>
+          <w:p>
+            <w:pPr>
+              <w:spacing w:after="40"/>
+            </w:pPr>
+            <w:r>
+              <w:rPr>
+                <w:rFonts w:ascii="Calibri" w:hAnsi="Calibri"/>
+                <w:sz w:val="21"/>
+              </w:rPr>
+              <w:t>Thunnus maccoyii</w:t>
+            </w:r>
+          </w:p>
+        </w:tc>
+        <w:tc>
+          <w:tcPr>
+            <w:tcW w:type="dxa" w:w="6710"/>
+            <w:vAlign w:val="center"/>
+            <w:shd w:fill="FFFFFF"/>
+            <w:tcMar>
+              <w:top w:w="90" w:type="dxa"/>
+              <w:bottom w:w="90" w:type="dxa"/>
+              <w:left w:w="110" w:type="dxa"/>
+              <w:right w:w="110" w:type="dxa"/>
+            </w:tcMar>
+            <w:tcBorders>
+              <w:top w:val="single" w:sz="5" w:color="D9D9D9"/>
+              <w:left w:val="single" w:sz="5" w:color="D9D9D9"/>
+              <w:bottom w:val="single" w:sz="5" w:color="D9D9D9"/>
+              <w:right w:val="single" w:sz="5" w:color="D9D9D9"/>
+            </w:tcBorders>
+          </w:tcPr>
+          <w:p>
+            <w:pPr>
+              <w:spacing w:after="40"/>
+            </w:pPr>
+            <w:r>
+              <w:rPr>
+                <w:rFonts w:ascii="Calibri" w:hAnsi="Calibri"/>
+                <w:sz w:val="21"/>
+              </w:rPr>
+              <w:t>Southern bluefin is absent from ETP7. Pacific bluefin is the closest represented taxonomic analogue, with cold-temperate geography, temperature and residency mismatches. Recorded 2019 landings are zero.</w:t>
+            </w:r>
+          </w:p>
+        </w:tc>
+      </w:tr>
+    </w:tbl>
+    <w:p>
+      <w:pPr>
+        <w:pStyle w:val="Heading1"/>
         <w:pageBreakBefore/>
         <w:keepNext/>
-        <w:pageBreakBefore/>
       </w:pPr>
       <w:r>
         <w:t>Geographic evidence screenshots</w:t>

</xml_diff>